<commit_message>
Update functionality overview and add session log
</commit_message>
<xml_diff>
--- a/docs/Schoox-Salesforce-Sync-Functionality-Overview.docx
+++ b/docs/Schoox-Salesforce-Sync-Functionality-Overview.docx
@@ -42,7 +42,7 @@
           <w:sz w:val="20"/>
           <w:szCs w:val="20"/>
         </w:rPr>
-        <w:t xml:space="preserve">Prototype in Salesforce org data-speed-169 · Repository: UMIUS-CREATIVE/SalesforceSchoox (PR #1)</w:t>
+        <w:t xml:space="preserve">Updated: live Schoox integration + deployed AWS Lambda · Salesforce org data-speed-169 · Repository: UMIUS-CREATIVE/SalesforceSchoox (PR #1)</w:t>
       </w:r>
     </w:p>
     <w:p>
@@ -59,54 +59,7 @@
         <w:spacing w:after="140"/>
       </w:pPr>
       <w:r>
-        <w:t xml:space="preserve">This prototype gives Salesforce visibility into each learner's Schoox LMS training progress — courses completed, courses in progress, estimated time remaining, and full learning history — directly on the learner's Contact record. A scheduled AWS Lambda function pulls data from the Schoox API, aggregates it per learner, and writes it into Salesforce over the REST API.</w:t>
-      </w:r>
-    </w:p>
-    <w:p>
-      <w:pPr>
-        <w:spacing w:after="140"/>
-      </w:pPr>
-      <w:r>
-        <w:t xml:space="preserve">Three systems are involved:</w:t>
-      </w:r>
-    </w:p>
-    <w:p>
-      <w:pPr>
-        <w:pStyle w:val="ListParagraph"/>
-        <w:numPr>
-          <w:ilvl w:val="0"/>
-          <w:numId w:val="2"/>
-        </w:numPr>
-        <w:spacing w:after="60"/>
-      </w:pPr>
-      <w:r>
-        <w:t xml:space="preserve">Schoox (source): holds each learner's course enrollments, completion percentage, and due dates.</w:t>
-      </w:r>
-    </w:p>
-    <w:p>
-      <w:pPr>
-        <w:pStyle w:val="ListParagraph"/>
-        <w:numPr>
-          <w:ilvl w:val="0"/>
-          <w:numId w:val="2"/>
-        </w:numPr>
-        <w:spacing w:after="60"/>
-      </w:pPr>
-      <w:r>
-        <w:t xml:space="preserve">AWS (middleware): a scheduled Lambda function that reads from Schoox, transforms the data, and pushes it to Salesforce.</w:t>
-      </w:r>
-    </w:p>
-    <w:p>
-      <w:pPr>
-        <w:pStyle w:val="ListParagraph"/>
-        <w:numPr>
-          <w:ilvl w:val="0"/>
-          <w:numId w:val="2"/>
-        </w:numPr>
-        <w:spacing w:after="60"/>
-      </w:pPr>
-      <w:r>
-        <w:t xml:space="preserve">Salesforce (destination): the learner's Contact record, now carrying eight custom fields plus a visible UI section showing this data.</w:t>
+        <w:t xml:space="preserve">This prototype gives Salesforce visibility into each learner's Schoox LMS training progress — courses completed, courses in progress, estimated time remaining, and full learning history — directly on the learner's Contact record. A scheduled AWS Lambda function pulls data from the live Schoox API, aggregates it per learner, and writes it into Salesforce over the REST API. This revision reflects the fully working, real-data version of the system: real Schoox API credentials, a verified endpoint contract, a deployed and schedule-driven AWS Lambda, and confirmed live data on Salesforce Contact records.</w:t>
       </w:r>
     </w:p>
     <w:p>
@@ -120,14 +73,6 @@
     </w:p>
     <w:p>
       <w:pPr>
-        <w:spacing w:after="140"/>
-      </w:pPr>
-      <w:r>
-        <w:t xml:space="preserve">Salesforce work fell into three parts: the data model (where the data lives), access control (who/what can see it), and the page layout (how it's actually displayed to a user opening a Contact record).</w:t>
-      </w:r>
-    </w:p>
-    <w:p>
-      <w:pPr>
         <w:pStyle w:val="Heading2"/>
         <w:spacing w:after="120" w:before="260"/>
       </w:pPr>
@@ -140,15 +85,7 @@
         <w:spacing w:after="140"/>
       </w:pPr>
       <w:r>
-        <w:t xml:space="preserve">The original design used a separate child object (one record per course enrollment, related to Contact). That design was blocked: the org (data-speed-169) is on Salesforce Base Edition, a trial edition with zero free custom-object slots — object creation failed with “reached maximum number of custom objects.”</w:t>
-      </w:r>
-    </w:p>
-    <w:p>
-      <w:pPr>
-        <w:spacing w:after="140"/>
-      </w:pPr>
-      <w:r>
-        <w:t xml:space="preserve">The design was reworked to add eight custom fields directly onto the standard Contact object instead, storing an aggregated summary per learner. This fits within the edition's limits and required no new custom object at all.</w:t>
+        <w:t xml:space="preserve">The org (data-speed-169) is on Salesforce Base Edition (trial), which has zero free custom-object slots — a child object design (one record per course enrollment) failed to deploy with “reached maximum number of custom objects.” The design was reworked to add eight custom fields directly onto the standard Contact object instead, storing an aggregated summary per learner.</w:t>
       </w:r>
     </w:p>
     <w:tbl>
@@ -737,7 +674,7 @@
                 <w:sz w:val="20"/>
                 <w:szCs w:val="20"/>
               </w:rPr>
-              <w:t xml:space="preserve">One line per course: name, status, % complete, due date — the full learning history.</w:t>
+              <w:t xml:space="preserve">One line per course: name, status, % complete, due date.</w:t>
             </w:r>
           </w:p>
         </w:tc>
@@ -818,6 +755,335 @@
       <w:pPr>
         <w:spacing w:after="200"/>
       </w:pPr>
+    </w:p>
+    <w:p>
+      <w:pPr>
+        <w:pStyle w:val="Heading2"/>
+        <w:spacing w:after="120" w:before="260"/>
+      </w:pPr>
+      <w:r>
+        <w:t xml:space="preserve">2.2 Permission Set — Learner_Course_Access</w:t>
+      </w:r>
+    </w:p>
+    <w:p>
+      <w:pPr>
+        <w:spacing w:after="140"/>
+      </w:pPr>
+      <w:r>
+        <w:t xml:space="preserve">New custom fields have zero visibility by default, even to administrators, until field-level security is explicitly granted. This permission set grants read access to all eight LMS_* fields and is assigned to admin@umiuscreative.com — both the Salesforce login used for this org and the Client Credentials Flow integration identity, confirmed via a direct User/PermissionSetAssignment query (System Administrator profile, 7 permission sets assigned including Learner_Course_Access).</w:t>
+      </w:r>
+    </w:p>
+    <w:p>
+      <w:pPr>
+        <w:pStyle w:val="Heading2"/>
+        <w:spacing w:after="120" w:before="260"/>
+      </w:pPr>
+      <w:r>
+        <w:t xml:space="preserve">2.3 Contact Page Layout</w:t>
+      </w:r>
+    </w:p>
+    <w:p>
+      <w:pPr>
+        <w:spacing w:after="140"/>
+      </w:pPr>
+      <w:r>
+        <w:t xml:space="preserve">The standard Contact-Contact Layout was updated with two new read-only sections: “Learning Progress (Schoox)” (enrolled/completed/in-progress counts, overall % complete, hours remaining, next due date, last synced) and “Learning History (Schoox)” (the per-course text breakdown). This is what makes the synced data visible to a person opening a Contact record, not just queryable via API.</w:t>
+      </w:r>
+    </w:p>
+    <w:p>
+      <w:pPr>
+        <w:pStyle w:val="Heading1"/>
+        <w:spacing w:after="160" w:before="320"/>
+      </w:pPr>
+      <w:r>
+        <w:t xml:space="preserve">3. Schoox API — Verified Integration</w:t>
+      </w:r>
+    </w:p>
+    <w:p>
+      <w:pPr>
+        <w:spacing w:after="140"/>
+      </w:pPr>
+      <w:r>
+        <w:t xml:space="preserve">The original scaffold guessed at Schoox's endpoint structure; it was wrong. The real contract was reverse-engineered against the live AliSFTesting academy:</w:t>
+      </w:r>
+    </w:p>
+    <w:p>
+      <w:pPr>
+        <w:pStyle w:val="ListParagraph"/>
+        <w:numPr>
+          <w:ilvl w:val="0"/>
+          <w:numId w:val="2"/>
+        </w:numPr>
+        <w:spacing w:after="60"/>
+      </w:pPr>
+      <w:r>
+        <w:t xml:space="preserve">Base URL is https://api.schoox.com/v1 — not www.schoox.com, which resolves to Schoox's marketing site and 404s.</w:t>
+      </w:r>
+    </w:p>
+    <w:p>
+      <w:pPr>
+        <w:pStyle w:val="ListParagraph"/>
+        <w:numPr>
+          <w:ilvl w:val="0"/>
+          <w:numId w:val="2"/>
+        </w:numPr>
+        <w:spacing w:after="60"/>
+      </w:pPr>
+      <w:r>
+        <w:t xml:space="preserve">Authentication is an X-Api-Key header carrying the academy API key, plus a required acadId query parameter — the numeric academy id (2024692081 for AliSFTesting), not the URL slug used in portal links.</w:t>
+      </w:r>
+    </w:p>
+    <w:p>
+      <w:pPr>
+        <w:pStyle w:val="ListParagraph"/>
+        <w:numPr>
+          <w:ilvl w:val="0"/>
+          <w:numId w:val="2"/>
+        </w:numPr>
+        <w:spacing w:after="60"/>
+      </w:pPr>
+      <w:r>
+        <w:t xml:space="preserve">There is no single “get a user's transcript” endpoint with progress data. Per-course, per-learner progress instead comes from GET /v1/courses/{courseId}/students, which returns time_enrolled, progress (%), time spent, and certificates for every enrolled learner.</w:t>
+      </w:r>
+    </w:p>
+    <w:p>
+      <w:pPr>
+        <w:pStyle w:val="ListParagraph"/>
+        <w:numPr>
+          <w:ilvl w:val="0"/>
+          <w:numId w:val="2"/>
+        </w:numPr>
+        <w:spacing w:after="60"/>
+      </w:pPr>
+      <w:r>
+        <w:t xml:space="preserve">schooxClient.js was rewritten to list academy courses (GET /v1/courses) and pivot each course's student roster into a per-learner transcript, which transform.js then aggregates into the Contact summary fields.</w:t>
+      </w:r>
+    </w:p>
+    <w:p>
+      <w:pPr>
+        <w:pStyle w:val="Heading1"/>
+        <w:spacing w:after="160" w:before="320"/>
+      </w:pPr>
+      <w:r>
+        <w:t xml:space="preserve">4. AWS Implementation</w:t>
+      </w:r>
+    </w:p>
+    <w:p>
+      <w:pPr>
+        <w:pStyle w:val="Heading2"/>
+        <w:spacing w:after="120" w:before="260"/>
+      </w:pPr>
+      <w:r>
+        <w:t xml:space="preserve">4.1 Lambda Modules</w:t>
+      </w:r>
+    </w:p>
+    <w:p>
+      <w:pPr>
+        <w:pStyle w:val="ListParagraph"/>
+        <w:numPr>
+          <w:ilvl w:val="0"/>
+          <w:numId w:val="2"/>
+        </w:numPr>
+        <w:spacing w:after="60"/>
+      </w:pPr>
+      <w:r>
+        <w:t xml:space="preserve">secrets.js — fetches and caches credentials from AWS Secrets Manager at runtime; nothing is hard-coded.</w:t>
+      </w:r>
+    </w:p>
+    <w:p>
+      <w:pPr>
+        <w:pStyle w:val="ListParagraph"/>
+        <w:numPr>
+          <w:ilvl w:val="0"/>
+          <w:numId w:val="2"/>
+        </w:numPr>
+        <w:spacing w:after="60"/>
+      </w:pPr>
+      <w:r>
+        <w:t xml:space="preserve">schooxClient.js — the verified Schoox API client described above.</w:t>
+      </w:r>
+    </w:p>
+    <w:p>
+      <w:pPr>
+        <w:pStyle w:val="ListParagraph"/>
+        <w:numPr>
+          <w:ilvl w:val="0"/>
+          <w:numId w:val="2"/>
+        </w:numPr>
+        <w:spacing w:after="60"/>
+      </w:pPr>
+      <w:r>
+        <w:t xml:space="preserve">salesforceClient.js — OAuth Client Credentials Flow authentication, Contact lookup by email, and the REST PATCH that writes the summary.</w:t>
+      </w:r>
+    </w:p>
+    <w:p>
+      <w:pPr>
+        <w:pStyle w:val="ListParagraph"/>
+        <w:numPr>
+          <w:ilvl w:val="0"/>
+          <w:numId w:val="2"/>
+        </w:numPr>
+        <w:spacing w:after="60"/>
+      </w:pPr>
+      <w:r>
+        <w:t xml:space="preserve">transform.js — reduces a learner's raw course entries into the eight-field Contact summary.</w:t>
+      </w:r>
+    </w:p>
+    <w:p>
+      <w:pPr>
+        <w:pStyle w:val="ListParagraph"/>
+        <w:numPr>
+          <w:ilvl w:val="0"/>
+          <w:numId w:val="2"/>
+        </w:numPr>
+        <w:spacing w:after="60"/>
+      </w:pPr>
+      <w:r>
+        <w:t xml:space="preserve">index.js — orchestrates the run: list Schoox users, build transcripts, match each to a Contact, sync or skip, log a result summary.</w:t>
+      </w:r>
+    </w:p>
+    <w:p>
+      <w:pPr>
+        <w:pStyle w:val="Heading2"/>
+        <w:spacing w:after="120" w:before="260"/>
+      </w:pPr>
+      <w:r>
+        <w:t xml:space="preserve">4.2 Deployed Infrastructure</w:t>
+      </w:r>
+    </w:p>
+    <w:p>
+      <w:pPr>
+        <w:spacing w:after="140"/>
+      </w:pPr>
+      <w:r>
+        <w:t xml:space="preserve">Deployed via aws cloudformation package/deploy (the sam CLI was not available in this environment, but CloudFormation supports the SAM transform natively — functionally identical).</w:t>
+      </w:r>
+    </w:p>
+    <w:p>
+      <w:pPr>
+        <w:pBdr>
+          <w:top w:val="single" w:color="DDDDDD" w:sz="2"/>
+          <w:bottom w:val="single" w:color="DDDDDD" w:sz="2"/>
+          <w:left w:val="single" w:color="DDDDDD" w:sz="2"/>
+          <w:right w:val="single" w:color="DDDDDD" w:sz="2"/>
+        </w:pBdr>
+        <w:shd w:fill="F4F4F4" w:val="clear"/>
+        <w:spacing w:after="140"/>
+      </w:pPr>
+      <w:r>
+        <w:rPr>
+          <w:rFonts w:ascii="Consolas" w:cs="Consolas" w:eastAsia="Consolas" w:hAnsi="Consolas"/>
+          <w:color w:val="1a1a1a"/>
+          <w:sz w:val="19"/>
+          <w:szCs w:val="19"/>
+        </w:rPr>
+        <w:t xml:space="preserve">Stack:      schoox-salesforce-sync</w:t>
+      </w:r>
+    </w:p>
+    <w:p>
+      <w:pPr>
+        <w:pBdr>
+          <w:top w:val="single" w:color="DDDDDD" w:sz="2"/>
+          <w:bottom w:val="single" w:color="DDDDDD" w:sz="2"/>
+          <w:left w:val="single" w:color="DDDDDD" w:sz="2"/>
+          <w:right w:val="single" w:color="DDDDDD" w:sz="2"/>
+        </w:pBdr>
+        <w:shd w:fill="F4F4F4" w:val="clear"/>
+        <w:spacing w:after="140"/>
+      </w:pPr>
+      <w:r>
+        <w:rPr>
+          <w:rFonts w:ascii="Consolas" w:cs="Consolas" w:eastAsia="Consolas" w:hAnsi="Consolas"/>
+          <w:color w:val="1a1a1a"/>
+          <w:sz w:val="19"/>
+          <w:szCs w:val="19"/>
+        </w:rPr>
+        <w:t xml:space="preserve">Account:    503561452191   Region: us-east-1</w:t>
+      </w:r>
+    </w:p>
+    <w:p>
+      <w:pPr>
+        <w:pBdr>
+          <w:top w:val="single" w:color="DDDDDD" w:sz="2"/>
+          <w:bottom w:val="single" w:color="DDDDDD" w:sz="2"/>
+          <w:left w:val="single" w:color="DDDDDD" w:sz="2"/>
+          <w:right w:val="single" w:color="DDDDDD" w:sz="2"/>
+        </w:pBdr>
+        <w:shd w:fill="F4F4F4" w:val="clear"/>
+        <w:spacing w:after="140"/>
+      </w:pPr>
+      <w:r>
+        <w:rPr>
+          <w:rFonts w:ascii="Consolas" w:cs="Consolas" w:eastAsia="Consolas" w:hAnsi="Consolas"/>
+          <w:color w:val="1a1a1a"/>
+          <w:sz w:val="19"/>
+          <w:szCs w:val="19"/>
+        </w:rPr>
+        <w:t xml:space="preserve">Lambda:     schoox-salesforce-sync-SyncFunction-XhESqwiur5xc  (nodejs20.x)</w:t>
+      </w:r>
+    </w:p>
+    <w:p>
+      <w:pPr>
+        <w:pBdr>
+          <w:top w:val="single" w:color="DDDDDD" w:sz="2"/>
+          <w:bottom w:val="single" w:color="DDDDDD" w:sz="2"/>
+          <w:left w:val="single" w:color="DDDDDD" w:sz="2"/>
+          <w:right w:val="single" w:color="DDDDDD" w:sz="2"/>
+        </w:pBdr>
+        <w:shd w:fill="F4F4F4" w:val="clear"/>
+        <w:spacing w:after="140"/>
+      </w:pPr>
+      <w:r>
+        <w:rPr>
+          <w:rFonts w:ascii="Consolas" w:cs="Consolas" w:eastAsia="Consolas" w:hAnsi="Consolas"/>
+          <w:color w:val="1a1a1a"/>
+          <w:sz w:val="19"/>
+          <w:szCs w:val="19"/>
+        </w:rPr>
+        <w:t xml:space="preserve">Schedule:   EventBridge rule, rate(6 hours), state ENABLED</w:t>
+      </w:r>
+    </w:p>
+    <w:p>
+      <w:pPr>
+        <w:pBdr>
+          <w:top w:val="single" w:color="DDDDDD" w:sz="2"/>
+          <w:bottom w:val="single" w:color="DDDDDD" w:sz="2"/>
+          <w:left w:val="single" w:color="DDDDDD" w:sz="2"/>
+          <w:right w:val="single" w:color="DDDDDD" w:sz="2"/>
+        </w:pBdr>
+        <w:shd w:fill="F4F4F4" w:val="clear"/>
+        <w:spacing w:after="140"/>
+      </w:pPr>
+      <w:r>
+        <w:rPr>
+          <w:rFonts w:ascii="Consolas" w:cs="Consolas" w:eastAsia="Consolas" w:hAnsi="Consolas"/>
+          <w:color w:val="1a1a1a"/>
+          <w:sz w:val="19"/>
+          <w:szCs w:val="19"/>
+        </w:rPr>
+        <w:t xml:space="preserve">Secrets:    schoox-salesforce-sync/schoox-api</w:t>
+      </w:r>
+    </w:p>
+    <w:p>
+      <w:pPr>
+        <w:pBdr>
+          <w:top w:val="single" w:color="DDDDDD" w:sz="2"/>
+          <w:bottom w:val="single" w:color="DDDDDD" w:sz="2"/>
+          <w:left w:val="single" w:color="DDDDDD" w:sz="2"/>
+          <w:right w:val="single" w:color="DDDDDD" w:sz="2"/>
+        </w:pBdr>
+        <w:shd w:fill="F4F4F4" w:val="clear"/>
+        <w:spacing w:after="140"/>
+      </w:pPr>
+      <w:r>
+        <w:rPr>
+          <w:rFonts w:ascii="Consolas" w:cs="Consolas" w:eastAsia="Consolas" w:hAnsi="Consolas"/>
+          <w:color w:val="1a1a1a"/>
+          <w:sz w:val="19"/>
+          <w:szCs w:val="19"/>
+        </w:rPr>
+        <w:t xml:space="preserve">            schoox-salesforce-sync/salesforce-auth</w:t>
+      </w:r>
     </w:p>
     <w:p>
       <w:pPr>
@@ -831,75 +1097,16 @@
           <w:sz w:val="20"/>
           <w:szCs w:val="20"/>
         </w:rPr>
-        <w:t xml:space="preserve">Trade-off: this gives a per-learner summary rather than a sortable, reportable list of individual course records. If the org is later upgraded past Base Edition (or a Developer Edition org is used), this can be revisited as a proper child object with a related list.</w:t>
-      </w:r>
-    </w:p>
-    <w:p>
-      <w:pPr>
-        <w:pStyle w:val="Heading2"/>
-        <w:spacing w:after="120" w:before="260"/>
-      </w:pPr>
-      <w:r>
-        <w:t xml:space="preserve">2.2 Permission Set — Learner_Course_Access</w:t>
-      </w:r>
-    </w:p>
-    <w:p>
-      <w:pPr>
-        <w:spacing w:after="140"/>
-      </w:pPr>
-      <w:r>
-        <w:t xml:space="preserve">New custom fields in Salesforce have zero visibility by default, even to administrators, until field-level security (FLS) is explicitly granted. The Learner_Course_Access permission set grants read access to all eight LMS_* fields, and has been assigned to the integration user (admin@umiuscreative.com) that the AWS Lambda authenticates as. Without this step, the sync would write data successfully but no one — including the API itself when querying back — would be able to read it.</w:t>
-      </w:r>
-    </w:p>
-    <w:p>
-      <w:pPr>
-        <w:pStyle w:val="Heading2"/>
-        <w:spacing w:after="120" w:before="260"/>
-      </w:pPr>
-      <w:r>
-        <w:t xml:space="preserve">2.3 Contact Page Layout</w:t>
-      </w:r>
-    </w:p>
-    <w:p>
-      <w:pPr>
-        <w:spacing w:after="140"/>
-      </w:pPr>
-      <w:r>
-        <w:t xml:space="preserve">Deployed data is only useful if someone can see it without writing a query. The standard Contact-Contact Layout was updated with two new sections so the synced data appears directly on the Contact record page in the Salesforce UI:</w:t>
-      </w:r>
-    </w:p>
-    <w:p>
-      <w:pPr>
-        <w:pStyle w:val="ListParagraph"/>
-        <w:numPr>
-          <w:ilvl w:val="0"/>
-          <w:numId w:val="2"/>
-        </w:numPr>
-        <w:spacing w:after="60"/>
-      </w:pPr>
-      <w:r>
-        <w:t xml:space="preserve">“Learning Progress (Schoox)” — a two-column summary: courses enrolled, completed, in progress, overall % complete, estimated hours remaining, next due date, and last-synced timestamp.</w:t>
-      </w:r>
-    </w:p>
-    <w:p>
-      <w:pPr>
-        <w:pStyle w:val="ListParagraph"/>
-        <w:numPr>
-          <w:ilvl w:val="0"/>
-          <w:numId w:val="2"/>
-        </w:numPr>
-        <w:spacing w:after="60"/>
-      </w:pPr>
-      <w:r>
-        <w:t xml:space="preserve">“Learning History (Schoox)” — the full per-course text breakdown (course name, status, % complete, due date).</w:t>
-      </w:r>
-    </w:p>
-    <w:p>
-      <w:pPr>
-        <w:spacing w:after="140"/>
-      </w:pPr>
-      <w:r>
-        <w:t xml:space="preserve">Both sections use read-only field behavior, since this data is written by the sync job, not edited by hand.</w:t>
+        <w:t xml:space="preserve">Verified genuinely running from AWS (not a local stand-in): the Lambda was invoked directly, and the LMS_Last_Synced__c timestamps written to Salesforce were checked against the Lambda's own CloudWatch log timestamps — they matched to the second.</w:t>
+      </w:r>
+    </w:p>
+    <w:p>
+      <w:pPr>
+        <w:pageBreakBefore/>
+      </w:pPr>
+      <w:r>
+        <w:br/>
+        <w:t xml:space="preserve"/>
       </w:r>
     </w:p>
     <w:p>
@@ -908,7 +1115,7 @@
         <w:spacing w:after="160" w:before="320"/>
       </w:pPr>
       <w:r>
-        <w:t xml:space="preserve">3. AWS Implementation</w:t>
+        <w:t xml:space="preserve">5. Live Sync Results</w:t>
       </w:r>
     </w:p>
     <w:p>
@@ -916,68 +1123,883 @@
         <w:spacing w:after="140"/>
       </w:pPr>
       <w:r>
-        <w:t xml:space="preserve">The AWS side is a single scheduled Lambda function, deployed via an AWS SAM (Serverless Application Model) template. It is split into five small modules, each with one responsibility:</w:t>
-      </w:r>
-    </w:p>
-    <w:p>
-      <w:pPr>
-        <w:pStyle w:val="Heading2"/>
-        <w:spacing w:after="120" w:before="260"/>
-      </w:pPr>
-      <w:r>
-        <w:t xml:space="preserve">3.1 secrets.js</w:t>
-      </w:r>
-    </w:p>
-    <w:p>
-      <w:pPr>
-        <w:spacing w:after="140"/>
-      </w:pPr>
-      <w:r>
-        <w:t xml:space="preserve">Fetches and caches credentials from AWS Secrets Manager at runtime, so no API key, client ID, or client secret is ever hard-coded or committed to source control. Two secrets are used: one holding the Schoox API key, one holding the Salesforce Consumer Key/Secret and login URL.</w:t>
-      </w:r>
-    </w:p>
-    <w:p>
-      <w:pPr>
-        <w:pStyle w:val="Heading2"/>
-        <w:spacing w:after="120" w:before="260"/>
-      </w:pPr>
-      <w:r>
-        <w:t xml:space="preserve">3.2 schooxClient.js</w:t>
-      </w:r>
-    </w:p>
-    <w:p>
-      <w:pPr>
-        <w:spacing w:after="140"/>
-      </w:pPr>
-      <w:r>
-        <w:t xml:space="preserve">Talks to the Schoox API. Two functions:</w:t>
-      </w:r>
-    </w:p>
-    <w:p>
-      <w:pPr>
-        <w:pStyle w:val="ListParagraph"/>
-        <w:numPr>
-          <w:ilvl w:val="0"/>
-          <w:numId w:val="2"/>
-        </w:numPr>
-        <w:spacing w:after="60"/>
-      </w:pPr>
-      <w:r>
-        <w:t xml:space="preserve">listUsers() — retrieves the active learners in the academy.</w:t>
-      </w:r>
-    </w:p>
-    <w:p>
-      <w:pPr>
-        <w:pStyle w:val="ListParagraph"/>
-        <w:numPr>
-          <w:ilvl w:val="0"/>
-          <w:numId w:val="2"/>
-        </w:numPr>
-        <w:spacing w:after="60"/>
-      </w:pPr>
-      <w:r>
-        <w:t xml:space="preserve">getUserTranscript(userId) — retrieves one learner's course enrollments and progress (their transcript).</w:t>
-      </w:r>
+        <w:t xml:space="preserve">The most recent scheduled/manual run processed all 5 Schoox learners in the academy:</w:t>
+      </w:r>
+    </w:p>
+    <w:tbl>
+      <w:tblPr>
+        <w:tblW w:type="dxa" w:w="9350"/>
+        <w:tblBorders>
+          <w:top w:val="single" w:color="auto" w:sz="4"/>
+          <w:left w:val="single" w:color="auto" w:sz="4"/>
+          <w:bottom w:val="single" w:color="auto" w:sz="4"/>
+          <w:right w:val="single" w:color="auto" w:sz="4"/>
+          <w:insideH w:val="single" w:color="auto" w:sz="4"/>
+          <w:insideV w:val="single" w:color="auto" w:sz="4"/>
+        </w:tblBorders>
+      </w:tblPr>
+      <w:tblGrid>
+        <w:gridCol w:w="2400"/>
+        <w:gridCol w:w="2600"/>
+        <w:gridCol w:w="1400"/>
+        <w:gridCol w:w="1000"/>
+        <w:gridCol w:w="950"/>
+        <w:gridCol w:w="1000"/>
+      </w:tblGrid>
+      <w:tr>
+        <w:trPr>
+          <w:tblHeader/>
+        </w:trPr>
+        <w:tc>
+          <w:tcPr>
+            <w:tcW w:type="dxa" w:w="2400"/>
+            <w:shd w:fill="2E5C8A" w:val="clear"/>
+            <w:tcMar>
+              <w:top w:type="dxa" w:w="80"/>
+              <w:left w:type="dxa" w:w="100"/>
+              <w:bottom w:type="dxa" w:w="80"/>
+              <w:right w:type="dxa" w:w="100"/>
+            </w:tcMar>
+          </w:tcPr>
+          <w:p>
+            <w:r>
+              <w:rPr>
+                <w:b/>
+                <w:bCs/>
+                <w:color w:val="FFFFFF"/>
+                <w:sz w:val="20"/>
+                <w:szCs w:val="20"/>
+              </w:rPr>
+              <w:t xml:space="preserve">Learner</w:t>
+            </w:r>
+          </w:p>
+        </w:tc>
+        <w:tc>
+          <w:tcPr>
+            <w:tcW w:type="dxa" w:w="2600"/>
+            <w:shd w:fill="2E5C8A" w:val="clear"/>
+            <w:tcMar>
+              <w:top w:type="dxa" w:w="80"/>
+              <w:left w:type="dxa" w:w="100"/>
+              <w:bottom w:type="dxa" w:w="80"/>
+              <w:right w:type="dxa" w:w="100"/>
+            </w:tcMar>
+          </w:tcPr>
+          <w:p>
+            <w:r>
+              <w:rPr>
+                <w:b/>
+                <w:bCs/>
+                <w:color w:val="FFFFFF"/>
+                <w:sz w:val="20"/>
+                <w:szCs w:val="20"/>
+              </w:rPr>
+              <w:t xml:space="preserve">Schoox Email</w:t>
+            </w:r>
+          </w:p>
+        </w:tc>
+        <w:tc>
+          <w:tcPr>
+            <w:tcW w:type="dxa" w:w="1400"/>
+            <w:shd w:fill="2E5C8A" w:val="clear"/>
+            <w:tcMar>
+              <w:top w:type="dxa" w:w="80"/>
+              <w:left w:type="dxa" w:w="100"/>
+              <w:bottom w:type="dxa" w:w="80"/>
+              <w:right w:type="dxa" w:w="100"/>
+            </w:tcMar>
+          </w:tcPr>
+          <w:p>
+            <w:r>
+              <w:rPr>
+                <w:b/>
+                <w:bCs/>
+                <w:color w:val="FFFFFF"/>
+                <w:sz w:val="20"/>
+                <w:szCs w:val="20"/>
+              </w:rPr>
+              <w:t xml:space="preserve">Sync Status</w:t>
+            </w:r>
+          </w:p>
+        </w:tc>
+        <w:tc>
+          <w:tcPr>
+            <w:tcW w:type="dxa" w:w="1000"/>
+            <w:shd w:fill="2E5C8A" w:val="clear"/>
+            <w:tcMar>
+              <w:top w:type="dxa" w:w="80"/>
+              <w:left w:type="dxa" w:w="100"/>
+              <w:bottom w:type="dxa" w:w="80"/>
+              <w:right w:type="dxa" w:w="100"/>
+            </w:tcMar>
+          </w:tcPr>
+          <w:p>
+            <w:r>
+              <w:rPr>
+                <w:b/>
+                <w:bCs/>
+                <w:color w:val="FFFFFF"/>
+                <w:sz w:val="20"/>
+                <w:szCs w:val="20"/>
+              </w:rPr>
+              <w:t xml:space="preserve">Completed</w:t>
+            </w:r>
+          </w:p>
+        </w:tc>
+        <w:tc>
+          <w:tcPr>
+            <w:tcW w:type="dxa" w:w="950"/>
+            <w:shd w:fill="2E5C8A" w:val="clear"/>
+            <w:tcMar>
+              <w:top w:type="dxa" w:w="80"/>
+              <w:left w:type="dxa" w:w="100"/>
+              <w:bottom w:type="dxa" w:w="80"/>
+              <w:right w:type="dxa" w:w="100"/>
+            </w:tcMar>
+          </w:tcPr>
+          <w:p>
+            <w:r>
+              <w:rPr>
+                <w:b/>
+                <w:bCs/>
+                <w:color w:val="FFFFFF"/>
+                <w:sz w:val="20"/>
+                <w:szCs w:val="20"/>
+              </w:rPr>
+              <w:t xml:space="preserve">% Complete</w:t>
+            </w:r>
+          </w:p>
+        </w:tc>
+        <w:tc>
+          <w:tcPr>
+            <w:tcW w:type="dxa" w:w="1000"/>
+            <w:shd w:fill="2E5C8A" w:val="clear"/>
+            <w:tcMar>
+              <w:top w:type="dxa" w:w="80"/>
+              <w:left w:type="dxa" w:w="100"/>
+              <w:bottom w:type="dxa" w:w="80"/>
+              <w:right w:type="dxa" w:w="100"/>
+            </w:tcMar>
+          </w:tcPr>
+          <w:p>
+            <w:r>
+              <w:rPr>
+                <w:b/>
+                <w:bCs/>
+                <w:color w:val="FFFFFF"/>
+                <w:sz w:val="20"/>
+                <w:szCs w:val="20"/>
+              </w:rPr>
+              <w:t xml:space="preserve">Last Synced</w:t>
+            </w:r>
+          </w:p>
+        </w:tc>
+      </w:tr>
+      <w:tr>
+        <w:tc>
+          <w:tcPr>
+            <w:tcW w:type="dxa" w:w="2400"/>
+            <w:tcMar>
+              <w:top w:type="dxa" w:w="80"/>
+              <w:left w:type="dxa" w:w="100"/>
+              <w:bottom w:type="dxa" w:w="80"/>
+              <w:right w:type="dxa" w:w="100"/>
+            </w:tcMar>
+          </w:tcPr>
+          <w:p>
+            <w:r>
+              <w:rPr>
+                <w:b w:val="false"/>
+                <w:bCs w:val="false"/>
+                <w:color w:val="1a1a1a"/>
+                <w:sz w:val="20"/>
+                <w:szCs w:val="20"/>
+              </w:rPr>
+              <w:t xml:space="preserve">Aastha Chaudhary</w:t>
+            </w:r>
+          </w:p>
+        </w:tc>
+        <w:tc>
+          <w:tcPr>
+            <w:tcW w:type="dxa" w:w="2600"/>
+            <w:tcMar>
+              <w:top w:type="dxa" w:w="80"/>
+              <w:left w:type="dxa" w:w="100"/>
+              <w:bottom w:type="dxa" w:w="80"/>
+              <w:right w:type="dxa" w:w="100"/>
+            </w:tcMar>
+          </w:tcPr>
+          <w:p>
+            <w:r>
+              <w:rPr>
+                <w:b w:val="false"/>
+                <w:bCs w:val="false"/>
+                <w:color w:val="1a1a1a"/>
+                <w:sz w:val="20"/>
+                <w:szCs w:val="20"/>
+              </w:rPr>
+              <w:t xml:space="preserve">caastha03@gmail.com</w:t>
+            </w:r>
+          </w:p>
+        </w:tc>
+        <w:tc>
+          <w:tcPr>
+            <w:tcW w:type="dxa" w:w="1400"/>
+            <w:tcMar>
+              <w:top w:type="dxa" w:w="80"/>
+              <w:left w:type="dxa" w:w="100"/>
+              <w:bottom w:type="dxa" w:w="80"/>
+              <w:right w:type="dxa" w:w="100"/>
+            </w:tcMar>
+          </w:tcPr>
+          <w:p>
+            <w:r>
+              <w:rPr>
+                <w:b w:val="false"/>
+                <w:bCs w:val="false"/>
+                <w:color w:val="1a1a1a"/>
+                <w:sz w:val="20"/>
+                <w:szCs w:val="20"/>
+              </w:rPr>
+              <w:t xml:space="preserve">Synced</w:t>
+            </w:r>
+          </w:p>
+        </w:tc>
+        <w:tc>
+          <w:tcPr>
+            <w:tcW w:type="dxa" w:w="1000"/>
+            <w:tcMar>
+              <w:top w:type="dxa" w:w="80"/>
+              <w:left w:type="dxa" w:w="100"/>
+              <w:bottom w:type="dxa" w:w="80"/>
+              <w:right w:type="dxa" w:w="100"/>
+            </w:tcMar>
+          </w:tcPr>
+          <w:p>
+            <w:r>
+              <w:rPr>
+                <w:b w:val="false"/>
+                <w:bCs w:val="false"/>
+                <w:color w:val="1a1a1a"/>
+                <w:sz w:val="20"/>
+                <w:szCs w:val="20"/>
+              </w:rPr>
+              <w:t xml:space="preserve">1 / 1</w:t>
+            </w:r>
+          </w:p>
+        </w:tc>
+        <w:tc>
+          <w:tcPr>
+            <w:tcW w:type="dxa" w:w="950"/>
+            <w:tcMar>
+              <w:top w:type="dxa" w:w="80"/>
+              <w:left w:type="dxa" w:w="100"/>
+              <w:bottom w:type="dxa" w:w="80"/>
+              <w:right w:type="dxa" w:w="100"/>
+            </w:tcMar>
+          </w:tcPr>
+          <w:p>
+            <w:r>
+              <w:rPr>
+                <w:b w:val="false"/>
+                <w:bCs w:val="false"/>
+                <w:color w:val="1a1a1a"/>
+                <w:sz w:val="20"/>
+                <w:szCs w:val="20"/>
+              </w:rPr>
+              <w:t xml:space="preserve">100%</w:t>
+            </w:r>
+          </w:p>
+        </w:tc>
+        <w:tc>
+          <w:tcPr>
+            <w:tcW w:type="dxa" w:w="1000"/>
+            <w:tcMar>
+              <w:top w:type="dxa" w:w="80"/>
+              <w:left w:type="dxa" w:w="100"/>
+              <w:bottom w:type="dxa" w:w="80"/>
+              <w:right w:type="dxa" w:w="100"/>
+            </w:tcMar>
+          </w:tcPr>
+          <w:p>
+            <w:r>
+              <w:rPr>
+                <w:b w:val="false"/>
+                <w:bCs w:val="false"/>
+                <w:color w:val="1a1a1a"/>
+                <w:sz w:val="20"/>
+                <w:szCs w:val="20"/>
+              </w:rPr>
+              <w:t xml:space="preserve">2026-08-21 00:56 UTC</w:t>
+            </w:r>
+          </w:p>
+        </w:tc>
+      </w:tr>
+      <w:tr>
+        <w:tc>
+          <w:tcPr>
+            <w:tcW w:type="dxa" w:w="2400"/>
+            <w:tcMar>
+              <w:top w:type="dxa" w:w="80"/>
+              <w:left w:type="dxa" w:w="100"/>
+              <w:bottom w:type="dxa" w:w="80"/>
+              <w:right w:type="dxa" w:w="100"/>
+            </w:tcMar>
+          </w:tcPr>
+          <w:p>
+            <w:r>
+              <w:rPr>
+                <w:b w:val="false"/>
+                <w:bCs w:val="false"/>
+                <w:color w:val="1a1a1a"/>
+                <w:sz w:val="20"/>
+                <w:szCs w:val="20"/>
+              </w:rPr>
+              <w:t xml:space="preserve">Mamtha Raj</w:t>
+            </w:r>
+          </w:p>
+        </w:tc>
+        <w:tc>
+          <w:tcPr>
+            <w:tcW w:type="dxa" w:w="2600"/>
+            <w:tcMar>
+              <w:top w:type="dxa" w:w="80"/>
+              <w:left w:type="dxa" w:w="100"/>
+              <w:bottom w:type="dxa" w:w="80"/>
+              <w:right w:type="dxa" w:w="100"/>
+            </w:tcMar>
+          </w:tcPr>
+          <w:p>
+            <w:r>
+              <w:rPr>
+                <w:b w:val="false"/>
+                <w:bCs w:val="false"/>
+                <w:color w:val="1a1a1a"/>
+                <w:sz w:val="20"/>
+                <w:szCs w:val="20"/>
+              </w:rPr>
+              <w:t xml:space="preserve">mamtha@umiuscreative.com</w:t>
+            </w:r>
+          </w:p>
+        </w:tc>
+        <w:tc>
+          <w:tcPr>
+            <w:tcW w:type="dxa" w:w="1400"/>
+            <w:tcMar>
+              <w:top w:type="dxa" w:w="80"/>
+              <w:left w:type="dxa" w:w="100"/>
+              <w:bottom w:type="dxa" w:w="80"/>
+              <w:right w:type="dxa" w:w="100"/>
+            </w:tcMar>
+          </w:tcPr>
+          <w:p>
+            <w:r>
+              <w:rPr>
+                <w:b w:val="false"/>
+                <w:bCs w:val="false"/>
+                <w:color w:val="1a1a1a"/>
+                <w:sz w:val="20"/>
+                <w:szCs w:val="20"/>
+              </w:rPr>
+              <w:t xml:space="preserve">Synced</w:t>
+            </w:r>
+          </w:p>
+        </w:tc>
+        <w:tc>
+          <w:tcPr>
+            <w:tcW w:type="dxa" w:w="1000"/>
+            <w:tcMar>
+              <w:top w:type="dxa" w:w="80"/>
+              <w:left w:type="dxa" w:w="100"/>
+              <w:bottom w:type="dxa" w:w="80"/>
+              <w:right w:type="dxa" w:w="100"/>
+            </w:tcMar>
+          </w:tcPr>
+          <w:p>
+            <w:r>
+              <w:rPr>
+                <w:b w:val="false"/>
+                <w:bCs w:val="false"/>
+                <w:color w:val="1a1a1a"/>
+                <w:sz w:val="20"/>
+                <w:szCs w:val="20"/>
+              </w:rPr>
+              <w:t xml:space="preserve">1 / 1</w:t>
+            </w:r>
+          </w:p>
+        </w:tc>
+        <w:tc>
+          <w:tcPr>
+            <w:tcW w:type="dxa" w:w="950"/>
+            <w:tcMar>
+              <w:top w:type="dxa" w:w="80"/>
+              <w:left w:type="dxa" w:w="100"/>
+              <w:bottom w:type="dxa" w:w="80"/>
+              <w:right w:type="dxa" w:w="100"/>
+            </w:tcMar>
+          </w:tcPr>
+          <w:p>
+            <w:r>
+              <w:rPr>
+                <w:b w:val="false"/>
+                <w:bCs w:val="false"/>
+                <w:color w:val="1a1a1a"/>
+                <w:sz w:val="20"/>
+                <w:szCs w:val="20"/>
+              </w:rPr>
+              <w:t xml:space="preserve">100%</w:t>
+            </w:r>
+          </w:p>
+        </w:tc>
+        <w:tc>
+          <w:tcPr>
+            <w:tcW w:type="dxa" w:w="1000"/>
+            <w:tcMar>
+              <w:top w:type="dxa" w:w="80"/>
+              <w:left w:type="dxa" w:w="100"/>
+              <w:bottom w:type="dxa" w:w="80"/>
+              <w:right w:type="dxa" w:w="100"/>
+            </w:tcMar>
+          </w:tcPr>
+          <w:p>
+            <w:r>
+              <w:rPr>
+                <w:b w:val="false"/>
+                <w:bCs w:val="false"/>
+                <w:color w:val="1a1a1a"/>
+                <w:sz w:val="20"/>
+                <w:szCs w:val="20"/>
+              </w:rPr>
+              <w:t xml:space="preserve">2026-08-21 00:56 UTC</w:t>
+            </w:r>
+          </w:p>
+        </w:tc>
+      </w:tr>
+      <w:tr>
+        <w:tc>
+          <w:tcPr>
+            <w:tcW w:type="dxa" w:w="2400"/>
+            <w:tcMar>
+              <w:top w:type="dxa" w:w="80"/>
+              <w:left w:type="dxa" w:w="100"/>
+              <w:bottom w:type="dxa" w:w="80"/>
+              <w:right w:type="dxa" w:w="100"/>
+            </w:tcMar>
+          </w:tcPr>
+          <w:p>
+            <w:r>
+              <w:rPr>
+                <w:b w:val="false"/>
+                <w:bCs w:val="false"/>
+                <w:color w:val="1a1a1a"/>
+                <w:sz w:val="20"/>
+                <w:szCs w:val="20"/>
+              </w:rPr>
+              <w:t xml:space="preserve">Shashank Bhardwaj</w:t>
+            </w:r>
+          </w:p>
+        </w:tc>
+        <w:tc>
+          <w:tcPr>
+            <w:tcW w:type="dxa" w:w="2600"/>
+            <w:tcMar>
+              <w:top w:type="dxa" w:w="80"/>
+              <w:left w:type="dxa" w:w="100"/>
+              <w:bottom w:type="dxa" w:w="80"/>
+              <w:right w:type="dxa" w:w="100"/>
+            </w:tcMar>
+          </w:tcPr>
+          <w:p>
+            <w:r>
+              <w:rPr>
+                <w:b w:val="false"/>
+                <w:bCs w:val="false"/>
+                <w:color w:val="1a1a1a"/>
+                <w:sz w:val="20"/>
+                <w:szCs w:val="20"/>
+              </w:rPr>
+              <w:t xml:space="preserve">shankusha19@gmail.com</w:t>
+            </w:r>
+          </w:p>
+        </w:tc>
+        <w:tc>
+          <w:tcPr>
+            <w:tcW w:type="dxa" w:w="1400"/>
+            <w:tcMar>
+              <w:top w:type="dxa" w:w="80"/>
+              <w:left w:type="dxa" w:w="100"/>
+              <w:bottom w:type="dxa" w:w="80"/>
+              <w:right w:type="dxa" w:w="100"/>
+            </w:tcMar>
+          </w:tcPr>
+          <w:p>
+            <w:r>
+              <w:rPr>
+                <w:b w:val="false"/>
+                <w:bCs w:val="false"/>
+                <w:color w:val="1a1a1a"/>
+                <w:sz w:val="20"/>
+                <w:szCs w:val="20"/>
+              </w:rPr>
+              <w:t xml:space="preserve">Synced</w:t>
+            </w:r>
+          </w:p>
+        </w:tc>
+        <w:tc>
+          <w:tcPr>
+            <w:tcW w:type="dxa" w:w="1000"/>
+            <w:tcMar>
+              <w:top w:type="dxa" w:w="80"/>
+              <w:left w:type="dxa" w:w="100"/>
+              <w:bottom w:type="dxa" w:w="80"/>
+              <w:right w:type="dxa" w:w="100"/>
+            </w:tcMar>
+          </w:tcPr>
+          <w:p>
+            <w:r>
+              <w:rPr>
+                <w:b w:val="false"/>
+                <w:bCs w:val="false"/>
+                <w:color w:val="1a1a1a"/>
+                <w:sz w:val="20"/>
+                <w:szCs w:val="20"/>
+              </w:rPr>
+              <w:t xml:space="preserve">1 / 1</w:t>
+            </w:r>
+          </w:p>
+        </w:tc>
+        <w:tc>
+          <w:tcPr>
+            <w:tcW w:type="dxa" w:w="950"/>
+            <w:tcMar>
+              <w:top w:type="dxa" w:w="80"/>
+              <w:left w:type="dxa" w:w="100"/>
+              <w:bottom w:type="dxa" w:w="80"/>
+              <w:right w:type="dxa" w:w="100"/>
+            </w:tcMar>
+          </w:tcPr>
+          <w:p>
+            <w:r>
+              <w:rPr>
+                <w:b w:val="false"/>
+                <w:bCs w:val="false"/>
+                <w:color w:val="1a1a1a"/>
+                <w:sz w:val="20"/>
+                <w:szCs w:val="20"/>
+              </w:rPr>
+              <w:t xml:space="preserve">100%</w:t>
+            </w:r>
+          </w:p>
+        </w:tc>
+        <w:tc>
+          <w:tcPr>
+            <w:tcW w:type="dxa" w:w="1000"/>
+            <w:tcMar>
+              <w:top w:type="dxa" w:w="80"/>
+              <w:left w:type="dxa" w:w="100"/>
+              <w:bottom w:type="dxa" w:w="80"/>
+              <w:right w:type="dxa" w:w="100"/>
+            </w:tcMar>
+          </w:tcPr>
+          <w:p>
+            <w:r>
+              <w:rPr>
+                <w:b w:val="false"/>
+                <w:bCs w:val="false"/>
+                <w:color w:val="1a1a1a"/>
+                <w:sz w:val="20"/>
+                <w:szCs w:val="20"/>
+              </w:rPr>
+              <w:t xml:space="preserve">2026-08-21 00:56 UTC</w:t>
+            </w:r>
+          </w:p>
+        </w:tc>
+      </w:tr>
+      <w:tr>
+        <w:tc>
+          <w:tcPr>
+            <w:tcW w:type="dxa" w:w="2400"/>
+            <w:tcMar>
+              <w:top w:type="dxa" w:w="80"/>
+              <w:left w:type="dxa" w:w="100"/>
+              <w:bottom w:type="dxa" w:w="80"/>
+              <w:right w:type="dxa" w:w="100"/>
+            </w:tcMar>
+          </w:tcPr>
+          <w:p>
+            <w:r>
+              <w:rPr>
+                <w:b w:val="false"/>
+                <w:bCs w:val="false"/>
+                <w:color w:val="1a1a1a"/>
+                <w:sz w:val="20"/>
+                <w:szCs w:val="20"/>
+              </w:rPr>
+              <w:t xml:space="preserve">Feroze MD (2 duplicate Contacts)</w:t>
+            </w:r>
+          </w:p>
+        </w:tc>
+        <w:tc>
+          <w:tcPr>
+            <w:tcW w:type="dxa" w:w="2600"/>
+            <w:tcMar>
+              <w:top w:type="dxa" w:w="80"/>
+              <w:left w:type="dxa" w:w="100"/>
+              <w:bottom w:type="dxa" w:w="80"/>
+              <w:right w:type="dxa" w:w="100"/>
+            </w:tcMar>
+          </w:tcPr>
+          <w:p>
+            <w:r>
+              <w:rPr>
+                <w:b w:val="false"/>
+                <w:bCs w:val="false"/>
+                <w:color w:val="1a1a1a"/>
+                <w:sz w:val="20"/>
+                <w:szCs w:val="20"/>
+              </w:rPr>
+              <w:t xml:space="preserve">not set on either Contact</w:t>
+            </w:r>
+          </w:p>
+        </w:tc>
+        <w:tc>
+          <w:tcPr>
+            <w:tcW w:type="dxa" w:w="1400"/>
+            <w:tcMar>
+              <w:top w:type="dxa" w:w="80"/>
+              <w:left w:type="dxa" w:w="100"/>
+              <w:bottom w:type="dxa" w:w="80"/>
+              <w:right w:type="dxa" w:w="100"/>
+            </w:tcMar>
+          </w:tcPr>
+          <w:p>
+            <w:r>
+              <w:rPr>
+                <w:b w:val="false"/>
+                <w:bCs w:val="false"/>
+                <w:color w:val="1a1a1a"/>
+                <w:sz w:val="20"/>
+                <w:szCs w:val="20"/>
+              </w:rPr>
+              <w:t xml:space="preserve">Skipped</w:t>
+            </w:r>
+          </w:p>
+        </w:tc>
+        <w:tc>
+          <w:tcPr>
+            <w:tcW w:type="dxa" w:w="1000"/>
+            <w:tcMar>
+              <w:top w:type="dxa" w:w="80"/>
+              <w:left w:type="dxa" w:w="100"/>
+              <w:bottom w:type="dxa" w:w="80"/>
+              <w:right w:type="dxa" w:w="100"/>
+            </w:tcMar>
+          </w:tcPr>
+          <w:p>
+            <w:r>
+              <w:rPr>
+                <w:b w:val="false"/>
+                <w:bCs w:val="false"/>
+                <w:color w:val="1a1a1a"/>
+                <w:sz w:val="20"/>
+                <w:szCs w:val="20"/>
+              </w:rPr>
+              <w:t xml:space="preserve">—</w:t>
+            </w:r>
+          </w:p>
+        </w:tc>
+        <w:tc>
+          <w:tcPr>
+            <w:tcW w:type="dxa" w:w="950"/>
+            <w:tcMar>
+              <w:top w:type="dxa" w:w="80"/>
+              <w:left w:type="dxa" w:w="100"/>
+              <w:bottom w:type="dxa" w:w="80"/>
+              <w:right w:type="dxa" w:w="100"/>
+            </w:tcMar>
+          </w:tcPr>
+          <w:p>
+            <w:r>
+              <w:rPr>
+                <w:b w:val="false"/>
+                <w:bCs w:val="false"/>
+                <w:color w:val="1a1a1a"/>
+                <w:sz w:val="20"/>
+                <w:szCs w:val="20"/>
+              </w:rPr>
+              <w:t xml:space="preserve">—</w:t>
+            </w:r>
+          </w:p>
+        </w:tc>
+        <w:tc>
+          <w:tcPr>
+            <w:tcW w:type="dxa" w:w="1000"/>
+            <w:tcMar>
+              <w:top w:type="dxa" w:w="80"/>
+              <w:left w:type="dxa" w:w="100"/>
+              <w:bottom w:type="dxa" w:w="80"/>
+              <w:right w:type="dxa" w:w="100"/>
+            </w:tcMar>
+          </w:tcPr>
+          <w:p>
+            <w:r>
+              <w:rPr>
+                <w:b w:val="false"/>
+                <w:bCs w:val="false"/>
+                <w:color w:val="1a1a1a"/>
+                <w:sz w:val="20"/>
+                <w:szCs w:val="20"/>
+              </w:rPr>
+              <w:t xml:space="preserve">never</w:t>
+            </w:r>
+          </w:p>
+        </w:tc>
+      </w:tr>
+      <w:tr>
+        <w:tc>
+          <w:tcPr>
+            <w:tcW w:type="dxa" w:w="2400"/>
+            <w:tcMar>
+              <w:top w:type="dxa" w:w="80"/>
+              <w:left w:type="dxa" w:w="100"/>
+              <w:bottom w:type="dxa" w:w="80"/>
+              <w:right w:type="dxa" w:w="100"/>
+            </w:tcMar>
+          </w:tcPr>
+          <w:p>
+            <w:r>
+              <w:rPr>
+                <w:b w:val="false"/>
+                <w:bCs w:val="false"/>
+                <w:color w:val="1a1a1a"/>
+                <w:sz w:val="20"/>
+                <w:szCs w:val="20"/>
+              </w:rPr>
+              <w:t xml:space="preserve">Ali Zaheer</w:t>
+            </w:r>
+          </w:p>
+        </w:tc>
+        <w:tc>
+          <w:tcPr>
+            <w:tcW w:type="dxa" w:w="2600"/>
+            <w:tcMar>
+              <w:top w:type="dxa" w:w="80"/>
+              <w:left w:type="dxa" w:w="100"/>
+              <w:bottom w:type="dxa" w:w="80"/>
+              <w:right w:type="dxa" w:w="100"/>
+            </w:tcMar>
+          </w:tcPr>
+          <w:p>
+            <w:r>
+              <w:rPr>
+                <w:b w:val="false"/>
+                <w:bCs w:val="false"/>
+                <w:color w:val="1a1a1a"/>
+                <w:sz w:val="20"/>
+                <w:szCs w:val="20"/>
+              </w:rPr>
+              <w:t xml:space="preserve">a.zaheer@schoox.com</w:t>
+            </w:r>
+          </w:p>
+        </w:tc>
+        <w:tc>
+          <w:tcPr>
+            <w:tcW w:type="dxa" w:w="1400"/>
+            <w:tcMar>
+              <w:top w:type="dxa" w:w="80"/>
+              <w:left w:type="dxa" w:w="100"/>
+              <w:bottom w:type="dxa" w:w="80"/>
+              <w:right w:type="dxa" w:w="100"/>
+            </w:tcMar>
+          </w:tcPr>
+          <w:p>
+            <w:r>
+              <w:rPr>
+                <w:b w:val="false"/>
+                <w:bCs w:val="false"/>
+                <w:color w:val="1a1a1a"/>
+                <w:sz w:val="20"/>
+                <w:szCs w:val="20"/>
+              </w:rPr>
+              <w:t xml:space="preserve">No Contact exists</w:t>
+            </w:r>
+          </w:p>
+        </w:tc>
+        <w:tc>
+          <w:tcPr>
+            <w:tcW w:type="dxa" w:w="1000"/>
+            <w:tcMar>
+              <w:top w:type="dxa" w:w="80"/>
+              <w:left w:type="dxa" w:w="100"/>
+              <w:bottom w:type="dxa" w:w="80"/>
+              <w:right w:type="dxa" w:w="100"/>
+            </w:tcMar>
+          </w:tcPr>
+          <w:p>
+            <w:r>
+              <w:rPr>
+                <w:b w:val="false"/>
+                <w:bCs w:val="false"/>
+                <w:color w:val="1a1a1a"/>
+                <w:sz w:val="20"/>
+                <w:szCs w:val="20"/>
+              </w:rPr>
+              <w:t xml:space="preserve">—</w:t>
+            </w:r>
+          </w:p>
+        </w:tc>
+        <w:tc>
+          <w:tcPr>
+            <w:tcW w:type="dxa" w:w="950"/>
+            <w:tcMar>
+              <w:top w:type="dxa" w:w="80"/>
+              <w:left w:type="dxa" w:w="100"/>
+              <w:bottom w:type="dxa" w:w="80"/>
+              <w:right w:type="dxa" w:w="100"/>
+            </w:tcMar>
+          </w:tcPr>
+          <w:p>
+            <w:r>
+              <w:rPr>
+                <w:b w:val="false"/>
+                <w:bCs w:val="false"/>
+                <w:color w:val="1a1a1a"/>
+                <w:sz w:val="20"/>
+                <w:szCs w:val="20"/>
+              </w:rPr>
+              <w:t xml:space="preserve">—</w:t>
+            </w:r>
+          </w:p>
+        </w:tc>
+        <w:tc>
+          <w:tcPr>
+            <w:tcW w:type="dxa" w:w="1000"/>
+            <w:tcMar>
+              <w:top w:type="dxa" w:w="80"/>
+              <w:left w:type="dxa" w:w="100"/>
+              <w:bottom w:type="dxa" w:w="80"/>
+              <w:right w:type="dxa" w:w="100"/>
+            </w:tcMar>
+          </w:tcPr>
+          <w:p>
+            <w:r>
+              <w:rPr>
+                <w:b w:val="false"/>
+                <w:bCs w:val="false"/>
+                <w:color w:val="1a1a1a"/>
+                <w:sz w:val="20"/>
+                <w:szCs w:val="20"/>
+              </w:rPr>
+              <w:t xml:space="preserve">never</w:t>
+            </w:r>
+          </w:p>
+        </w:tc>
+      </w:tr>
+    </w:tbl>
+    <w:p>
+      <w:pPr>
+        <w:spacing w:after="200"/>
+      </w:pPr>
     </w:p>
     <w:p>
       <w:pPr>
@@ -991,248 +2013,7 @@
           <w:sz w:val="20"/>
           <w:szCs w:val="20"/>
         </w:rPr>
-        <w:t xml:space="preserve">Note: the exact endpoint paths in this file are a best-effort scaffold based on Schoox's typical REST structure. Schoox API credentials have not yet been issued, so these paths have not been verified against real Schoox API documentation — this is flagged as a pending item.</w:t>
-      </w:r>
-    </w:p>
-    <w:p>
-      <w:pPr>
-        <w:pStyle w:val="Heading2"/>
-        <w:spacing w:after="120" w:before="260"/>
-      </w:pPr>
-      <w:r>
-        <w:t xml:space="preserve">3.3 salesforceClient.js</w:t>
-      </w:r>
-    </w:p>
-    <w:p>
-      <w:pPr>
-        <w:spacing w:after="140"/>
-      </w:pPr>
-      <w:r>
-        <w:t xml:space="preserve">Talks to Salesforce using the OAuth 2.0 Client Credentials Flow (machine-to-machine authentication, no interactive login). Two functions:</w:t>
-      </w:r>
-    </w:p>
-    <w:p>
-      <w:pPr>
-        <w:pStyle w:val="ListParagraph"/>
-        <w:numPr>
-          <w:ilvl w:val="0"/>
-          <w:numId w:val="2"/>
-        </w:numPr>
-        <w:spacing w:after="60"/>
-      </w:pPr>
-      <w:r>
-        <w:t xml:space="preserve">findContactIdByEmail(email) — looks up the Salesforce Contact matching a Schoox learner, using email as the match key.</w:t>
-      </w:r>
-    </w:p>
-    <w:p>
-      <w:pPr>
-        <w:pStyle w:val="ListParagraph"/>
-        <w:numPr>
-          <w:ilvl w:val="0"/>
-          <w:numId w:val="2"/>
-        </w:numPr>
-        <w:spacing w:after="60"/>
-      </w:pPr>
-      <w:r>
-        <w:t xml:space="preserve">updateContactLmsSummary(contactId, fields) — writes the aggregated LMS_* summary onto that Contact via a REST PATCH request.</w:t>
-      </w:r>
-    </w:p>
-    <w:p>
-      <w:pPr>
-        <w:spacing w:after="140"/>
-      </w:pPr>
-      <w:r>
-        <w:t xml:space="preserve">Access tokens are cached in memory and refreshed every 15 minutes, so the function does not re-authenticate on every request.</w:t>
-      </w:r>
-    </w:p>
-    <w:p>
-      <w:pPr>
-        <w:pStyle w:val="Heading2"/>
-        <w:spacing w:after="120" w:before="260"/>
-      </w:pPr>
-      <w:r>
-        <w:t xml:space="preserve">3.4 transform.js</w:t>
-      </w:r>
-    </w:p>
-    <w:p>
-      <w:pPr>
-        <w:spacing w:after="140"/>
-      </w:pPr>
-      <w:r>
-        <w:t xml:space="preserve">The core business logic. buildContactLmsSummary() takes a learner's raw list of Schoox course entries and reduces it into the eight-field summary that gets written to Salesforce:</w:t>
-      </w:r>
-    </w:p>
-    <w:p>
-      <w:pPr>
-        <w:pStyle w:val="ListParagraph"/>
-        <w:numPr>
-          <w:ilvl w:val="0"/>
-          <w:numId w:val="2"/>
-        </w:numPr>
-        <w:spacing w:after="60"/>
-      </w:pPr>
-      <w:r>
-        <w:t xml:space="preserve">Counts courses as completed, in-progress, or not-started based on completion/due-date data.</w:t>
-      </w:r>
-    </w:p>
-    <w:p>
-      <w:pPr>
-        <w:pStyle w:val="ListParagraph"/>
-        <w:numPr>
-          <w:ilvl w:val="0"/>
-          <w:numId w:val="2"/>
-        </w:numPr>
-        <w:spacing w:after="60"/>
-      </w:pPr>
-      <w:r>
-        <w:t xml:space="preserve">Computes the average percent-complete across all courses.</w:t>
-      </w:r>
-    </w:p>
-    <w:p>
-      <w:pPr>
-        <w:pStyle w:val="ListParagraph"/>
-        <w:numPr>
-          <w:ilvl w:val="0"/>
-          <w:numId w:val="2"/>
-        </w:numPr>
-        <w:spacing w:after="60"/>
-      </w:pPr>
-      <w:r>
-        <w:t xml:space="preserve">Sums estimated remaining hours across incomplete courses (derived from course duration minus time already completed).</w:t>
-      </w:r>
-    </w:p>
-    <w:p>
-      <w:pPr>
-        <w:pStyle w:val="ListParagraph"/>
-        <w:numPr>
-          <w:ilvl w:val="0"/>
-          <w:numId w:val="2"/>
-        </w:numPr>
-        <w:spacing w:after="60"/>
-      </w:pPr>
-      <w:r>
-        <w:t xml:space="preserve">Finds the earliest due date among incomplete courses.</w:t>
-      </w:r>
-    </w:p>
-    <w:p>
-      <w:pPr>
-        <w:pStyle w:val="ListParagraph"/>
-        <w:numPr>
-          <w:ilvl w:val="0"/>
-          <w:numId w:val="2"/>
-        </w:numPr>
-        <w:spacing w:after="60"/>
-      </w:pPr>
-      <w:r>
-        <w:t xml:space="preserve">Builds the human-readable, per-course learning-history text block.</w:t>
-      </w:r>
-    </w:p>
-    <w:p>
-      <w:pPr>
-        <w:pStyle w:val="ListParagraph"/>
-        <w:numPr>
-          <w:ilvl w:val="0"/>
-          <w:numId w:val="2"/>
-        </w:numPr>
-        <w:spacing w:after="60"/>
-      </w:pPr>
-      <w:r>
-        <w:t xml:space="preserve">Stamps the current time as the last-synced timestamp.</w:t>
-      </w:r>
-    </w:p>
-    <w:p>
-      <w:pPr>
-        <w:pStyle w:val="Heading2"/>
-        <w:spacing w:after="120" w:before="260"/>
-      </w:pPr>
-      <w:r>
-        <w:t xml:space="preserve">3.5 index.js — the orchestrator</w:t>
-      </w:r>
-    </w:p>
-    <w:p>
-      <w:pPr>
-        <w:spacing w:after="140"/>
-      </w:pPr>
-      <w:r>
-        <w:t xml:space="preserve">The Lambda entry point. For each Schoox user: looks up their Salesforce Contact, skips them (and logs a warning) if no match is found, otherwise fetches their transcript, runs it through transform.js, and writes the result to Salesforce. Returns a summary count of records synced, skipped, and failed, which appears in CloudWatch logs after each scheduled run.</w:t>
-      </w:r>
-    </w:p>
-    <w:p>
-      <w:pPr>
-        <w:pStyle w:val="Heading2"/>
-        <w:spacing w:after="120" w:before="260"/>
-      </w:pPr>
-      <w:r>
-        <w:t xml:space="preserve">3.6 template.yaml — Infrastructure as Code</w:t>
-      </w:r>
-    </w:p>
-    <w:p>
-      <w:pPr>
-        <w:spacing w:after="140"/>
-      </w:pPr>
-      <w:r>
-        <w:t xml:space="preserve">An AWS SAM template defining everything the Lambda needs to run:</w:t>
-      </w:r>
-    </w:p>
-    <w:p>
-      <w:pPr>
-        <w:pStyle w:val="ListParagraph"/>
-        <w:numPr>
-          <w:ilvl w:val="0"/>
-          <w:numId w:val="2"/>
-        </w:numPr>
-        <w:spacing w:after="60"/>
-      </w:pPr>
-      <w:r>
-        <w:t xml:space="preserve">The Lambda function itself (Node.js 20 runtime, 5-minute timeout).</w:t>
-      </w:r>
-    </w:p>
-    <w:p>
-      <w:pPr>
-        <w:pStyle w:val="ListParagraph"/>
-        <w:numPr>
-          <w:ilvl w:val="0"/>
-          <w:numId w:val="2"/>
-        </w:numPr>
-        <w:spacing w:after="60"/>
-      </w:pPr>
-      <w:r>
-        <w:t xml:space="preserve">An EventBridge scheduled rule triggering it automatically (default: every 6 hours, configurable).</w:t>
-      </w:r>
-    </w:p>
-    <w:p>
-      <w:pPr>
-        <w:pStyle w:val="ListParagraph"/>
-        <w:numPr>
-          <w:ilvl w:val="0"/>
-          <w:numId w:val="2"/>
-        </w:numPr>
-        <w:spacing w:after="60"/>
-      </w:pPr>
-      <w:r>
-        <w:t xml:space="preserve">Two AWS Secrets Manager entries (seeded with placeholder values, populated with real credentials after first deploy — never in source control).</w:t>
-      </w:r>
-    </w:p>
-    <w:p>
-      <w:pPr>
-        <w:pStyle w:val="ListParagraph"/>
-        <w:numPr>
-          <w:ilvl w:val="0"/>
-          <w:numId w:val="2"/>
-        </w:numPr>
-        <w:spacing w:after="60"/>
-      </w:pPr>
-      <w:r>
-        <w:t xml:space="preserve">An IAM policy scoping the Lambda's permissions to only read those two specific secrets.</w:t>
-      </w:r>
-    </w:p>
-    <w:p>
-      <w:pPr>
-        <w:pageBreakBefore/>
-      </w:pPr>
-      <w:r>
-        <w:br/>
-        <w:t xml:space="preserve"/>
+        <w:t xml:space="preserve">Two learners remain unsynced: Ali Zaheer has no corresponding Salesforce Contact at all, and Feroze MD exists as two separate (likely duplicate) Contact records, neither with an Email value set — the sync intentionally skips rather than guessing which duplicate to populate.</w:t>
       </w:r>
     </w:p>
     <w:p>
@@ -1241,7 +2022,7 @@
         <w:spacing w:after="160" w:before="320"/>
       </w:pPr>
       <w:r>
-        <w:t xml:space="preserve">4. End-to-End Data Flow</w:t>
+        <w:t xml:space="preserve">6. End-to-End Data Flow</w:t>
       </w:r>
     </w:p>
     <w:p>
@@ -1254,7 +2035,7 @@
         <w:spacing w:after="60"/>
       </w:pPr>
       <w:r>
-        <w:t xml:space="preserve">EventBridge triggers the Lambda function on schedule (default: every 6 hours).</w:t>
+        <w:t xml:space="preserve">EventBridge triggers the Lambda on schedule (every 6 hours), or it is invoked manually on demand.</w:t>
       </w:r>
     </w:p>
     <w:p>
@@ -1280,7 +2061,7 @@
         <w:spacing w:after="60"/>
       </w:pPr>
       <w:r>
-        <w:t xml:space="preserve">It authenticates to Salesforce using the OAuth Client Credentials Flow and obtains an access token.</w:t>
+        <w:t xml:space="preserve">It authenticates to Salesforce via OAuth Client Credentials Flow.</w:t>
       </w:r>
     </w:p>
     <w:p>
@@ -1293,7 +2074,7 @@
         <w:spacing w:after="60"/>
       </w:pPr>
       <w:r>
-        <w:t xml:space="preserve">It calls the Schoox API to list all active learners in the academy.</w:t>
+        <w:t xml:space="preserve">It calls Schoox for the academy's user list and course catalog.</w:t>
       </w:r>
     </w:p>
     <w:p>
@@ -1306,7 +2087,7 @@
         <w:spacing w:after="60"/>
       </w:pPr>
       <w:r>
-        <w:t xml:space="preserve">For each learner, it looks up their matching Salesforce Contact by email.</w:t>
+        <w:t xml:space="preserve">For each course, it fetches the enrolled-student roster (progress, enrollment date, certificates) and pivots it into a per-learner transcript.</w:t>
       </w:r>
     </w:p>
     <w:p>
@@ -1319,7 +2100,7 @@
         <w:spacing w:after="60"/>
       </w:pPr>
       <w:r>
-        <w:t xml:space="preserve">It fetches that learner's course transcript from Schoox.</w:t>
+        <w:t xml:space="preserve">For each learner, it looks up the matching Salesforce Contact by email.</w:t>
       </w:r>
     </w:p>
     <w:p>
@@ -1332,7 +2113,7 @@
         <w:spacing w:after="60"/>
       </w:pPr>
       <w:r>
-        <w:t xml:space="preserve">It aggregates the transcript into the eight-field LMS summary (transform.js).</w:t>
+        <w:t xml:space="preserve">It aggregates that learner's course entries into the eight-field summary.</w:t>
       </w:r>
     </w:p>
     <w:p>
@@ -1345,7 +2126,7 @@
         <w:spacing w:after="60"/>
       </w:pPr>
       <w:r>
-        <w:t xml:space="preserve">It writes the summary onto the Contact record via a Salesforce REST API PATCH request.</w:t>
+        <w:t xml:space="preserve">It PATCHes the summary onto the Contact via the Salesforce REST API.</w:t>
       </w:r>
     </w:p>
     <w:p>
@@ -1358,7 +2139,7 @@
         <w:spacing w:after="60"/>
       </w:pPr>
       <w:r>
-        <w:t xml:space="preserve">Anyone opening that Contact record in Salesforce immediately sees the “Learning Progress (Schoox)” and “Learning History (Schoox)” sections, reflecting the latest sync.</w:t>
+        <w:t xml:space="preserve">Anyone opening that Contact record in Salesforce — including admin@umiuscreative.com — immediately sees the current data in the “Learning Progress” and “Learning History” sections.</w:t>
       </w:r>
     </w:p>
     <w:p>
@@ -1367,7 +2148,7 @@
         <w:spacing w:after="160" w:before="320"/>
       </w:pPr>
       <w:r>
-        <w:t xml:space="preserve">5. Implementation Status</w:t>
+        <w:t xml:space="preserve">7. Implementation Status</w:t>
       </w:r>
     </w:p>
     <w:tbl>
@@ -1603,7 +2384,7 @@
                 <w:sz w:val="20"/>
                 <w:szCs w:val="20"/>
               </w:rPr>
-              <w:t xml:space="preserve">Fields verified queryable via Salesforce REST API</w:t>
+              <w:t xml:space="preserve">Contact page layout updated with Learning Progress / History sections</w:t>
             </w:r>
           </w:p>
         </w:tc>
@@ -1651,7 +2432,7 @@
                 <w:sz w:val="20"/>
                 <w:szCs w:val="20"/>
               </w:rPr>
-              <w:t xml:space="preserve">Contact page layout updated to display LMS sections in the UI</w:t>
+              <w:t xml:space="preserve">Real Schoox API access obtained and endpoint contract reverse-engineered</w:t>
             </w:r>
           </w:p>
         </w:tc>
@@ -1699,7 +2480,7 @@
                 <w:sz w:val="20"/>
                 <w:szCs w:val="20"/>
               </w:rPr>
-              <w:t xml:space="preserve">AWS Lambda sync function written (Schoox → transform → Salesforce)</w:t>
+              <w:t xml:space="preserve">schooxClient.js rewritten and verified against the live academy</w:t>
             </w:r>
           </w:p>
         </w:tc>
@@ -1747,7 +2528,7 @@
                 <w:sz w:val="20"/>
                 <w:szCs w:val="20"/>
               </w:rPr>
-              <w:t xml:space="preserve">AWS SAM template for scheduled deployment written</w:t>
+              <w:t xml:space="preserve">End-to-end sync run with real learner data (3 of 5 learners)</w:t>
             </w:r>
           </w:p>
         </w:tc>
@@ -1795,7 +2576,7 @@
                 <w:sz w:val="20"/>
                 <w:szCs w:val="20"/>
               </w:rPr>
-              <w:t xml:space="preserve">Code pushed to GitHub, pull request opened for review</w:t>
+              <w:t xml:space="preserve">AWS Lambda deployed and confirmed running on a 6-hour schedule</w:t>
             </w:r>
           </w:p>
         </w:tc>
@@ -1843,7 +2624,55 @@
                 <w:sz w:val="20"/>
                 <w:szCs w:val="20"/>
               </w:rPr>
-              <w:t xml:space="preserve">Schoox API credentials obtained</w:t>
+              <w:t xml:space="preserve">Code pushed to GitHub, pull request open for review</w:t>
+            </w:r>
+          </w:p>
+        </w:tc>
+        <w:tc>
+          <w:tcPr>
+            <w:tcW w:type="dxa" w:w="1200"/>
+            <w:tcMar>
+              <w:top w:type="dxa" w:w="80"/>
+              <w:left w:type="dxa" w:w="100"/>
+              <w:bottom w:type="dxa" w:w="80"/>
+              <w:right w:type="dxa" w:w="100"/>
+            </w:tcMar>
+          </w:tcPr>
+          <w:p>
+            <w:r>
+              <w:rPr>
+                <w:b/>
+                <w:bCs/>
+                <w:color w:val="1E7A34"/>
+                <w:sz w:val="20"/>
+                <w:szCs w:val="20"/>
+              </w:rPr>
+              <w:t xml:space="preserve">Done</w:t>
+            </w:r>
+          </w:p>
+        </w:tc>
+      </w:tr>
+      <w:tr>
+        <w:tc>
+          <w:tcPr>
+            <w:tcW w:type="dxa" w:w="8150"/>
+            <w:tcMar>
+              <w:top w:type="dxa" w:w="80"/>
+              <w:left w:type="dxa" w:w="100"/>
+              <w:bottom w:type="dxa" w:w="80"/>
+              <w:right w:type="dxa" w:w="100"/>
+            </w:tcMar>
+          </w:tcPr>
+          <w:p>
+            <w:r>
+              <w:rPr>
+                <w:b w:val="false"/>
+                <w:bCs w:val="false"/>
+                <w:color w:val="1a1a1a"/>
+                <w:sz w:val="20"/>
+                <w:szCs w:val="20"/>
+              </w:rPr>
+              <w:t xml:space="preserve">2 of 5 Schoox learners still unmatched (missing Contact email / no Contact)</w:t>
             </w:r>
           </w:p>
         </w:tc>
@@ -1891,7 +2720,7 @@
                 <w:sz w:val="20"/>
                 <w:szCs w:val="20"/>
               </w:rPr>
-              <w:t xml:space="preserve">Schoox endpoint paths verified against real API docs</w:t>
+              <w:t xml:space="preserve">Duplicate Feroze MD Contact records need to be resolved</w:t>
             </w:r>
           </w:p>
         </w:tc>
@@ -1939,55 +2768,7 @@
                 <w:sz w:val="20"/>
                 <w:szCs w:val="20"/>
               </w:rPr>
-              <w:t xml:space="preserve">AWS Lambda deployed to a live AWS account</w:t>
-            </w:r>
-          </w:p>
-        </w:tc>
-        <w:tc>
-          <w:tcPr>
-            <w:tcW w:type="dxa" w:w="1200"/>
-            <w:tcMar>
-              <w:top w:type="dxa" w:w="80"/>
-              <w:left w:type="dxa" w:w="100"/>
-              <w:bottom w:type="dxa" w:w="80"/>
-              <w:right w:type="dxa" w:w="100"/>
-            </w:tcMar>
-          </w:tcPr>
-          <w:p>
-            <w:r>
-              <w:rPr>
-                <w:b/>
-                <w:bCs/>
-                <w:color w:val="B8860B"/>
-                <w:sz w:val="20"/>
-                <w:szCs w:val="20"/>
-              </w:rPr>
-              <w:t xml:space="preserve">Pending</w:t>
-            </w:r>
-          </w:p>
-        </w:tc>
-      </w:tr>
-      <w:tr>
-        <w:tc>
-          <w:tcPr>
-            <w:tcW w:type="dxa" w:w="8150"/>
-            <w:tcMar>
-              <w:top w:type="dxa" w:w="80"/>
-              <w:left w:type="dxa" w:w="100"/>
-              <w:bottom w:type="dxa" w:w="80"/>
-              <w:right w:type="dxa" w:w="100"/>
-            </w:tcMar>
-          </w:tcPr>
-          <w:p>
-            <w:r>
-              <w:rPr>
-                <w:b w:val="false"/>
-                <w:bCs w:val="false"/>
-                <w:color w:val="1a1a1a"/>
-                <w:sz w:val="20"/>
-                <w:szCs w:val="20"/>
-              </w:rPr>
-              <w:t xml:space="preserve">End-to-end sync tested with real learner data</w:t>
+              <w:t xml:space="preserve">Exposed credentials (AWS, Salesforce, Schoox) rotated after prototyping</w:t>
             </w:r>
           </w:p>
         </w:tc>
@@ -2030,7 +2811,7 @@
           <w:b/>
           <w:bCs/>
         </w:rPr>
-        <w:t xml:space="preserve">The two blocking prerequisites for a live, real-data sync are: (1) obtaining Schoox API credentials, and (2) verifying the Schoox endpoint paths in schooxClient.js against real API documentation once those credentials are issued. Everything on the Salesforce and AWS-code side is complete and verified.</w:t>
+        <w:t xml:space="preserve">The system is functionally complete and running end-to-end on real data. What remains is data cleanup on the Salesforce side (missing Contact, duplicate Contact) rather than any integration work, plus standard hygiene: rotating the credentials that were used during interactive setup and testing.</w:t>
       </w:r>
     </w:p>
     <w:p>
@@ -2039,7 +2820,7 @@
         <w:spacing w:after="160" w:before="320"/>
       </w:pPr>
       <w:r>
-        <w:t xml:space="preserve">6. Repository</w:t>
+        <w:t xml:space="preserve">8. Repository</w:t>
       </w:r>
     </w:p>
     <w:p>
@@ -2047,7 +2828,7 @@
         <w:spacing w:after="140"/>
       </w:pPr>
       <w:r>
-        <w:t xml:space="preserve">All code is version-controlled at:</w:t>
+        <w:t xml:space="preserve">All code is version-controlled and the pull request tracks every change made in this engagement:</w:t>
       </w:r>
     </w:p>
     <w:p>
@@ -2069,14 +2850,6 @@
           <w:szCs w:val="19"/>
         </w:rPr>
         <w:t xml:space="preserve">https://github.com/UMIUS-CREATIVE/SalesforceSchoox</w:t>
-      </w:r>
-    </w:p>
-    <w:p>
-      <w:pPr>
-        <w:spacing w:after="140"/>
-      </w:pPr>
-      <w:r>
-        <w:t xml:space="preserve">Changes are proposed via pull request (from a fork, since direct write access to the org repository has not yet been granted):</w:t>
       </w:r>
     </w:p>
     <w:p>

</xml_diff>